<commit_message>
Aendere Plan-Vorlagen: Adresse, Grossschreibung, feste Daten
Lehrerstundenplan, Schuelerstundenplan und Diensteinsatzplan:
- Adresse ohne leere Zwischenzeile (nicht-leere Teile werden von oben
  nach unten gepackt, leere Slots rutschen ans Ende)
- Konsequente Grossschreibung der Fusszeilen-Labels (Erstellt am,
  Genehmigt am, Gesehen am)
- Feste Daten: Erstellungsdatum = heute, Genehmigungsdatum = heute + 1
  Tag (im Diensteinsatzplan fuer beide Genehmigungszeilen)

Die beiden Word-Vorlagen erhielten dafuer einen ${genehmigt}-Platzhalter;
im Diensteinsatzplan wurden die Labels zusaetzlich grossgeschrieben.

Co-Authored-By: Claude Opus 4.8 <noreply@anthropic.com>
</commit_message>
<xml_diff>
--- a/src/assets/diensteinsatzplan_template.docx
+++ b/src/assets/diensteinsatzplan_template.docx
@@ -6053,7 +6053,7 @@
                 <w:sz w:val="16"/>
                 <w:szCs w:val="16"/>
               </w:rPr>
-              <w:t>erstellt am</w:t>
+              <w:t>Erstellt am</w:t>
             </w:r>
           </w:p>
         </w:tc>
@@ -6428,7 +6428,7 @@
                 <w:sz w:val="16"/>
                 <w:szCs w:val="16"/>
               </w:rPr>
-              <w:t>genehmigt am</w:t>
+              <w:t xml:space="preserve">Genehmigt am ${genehmigt}</w:t>
             </w:r>
           </w:p>
         </w:tc>
@@ -6795,7 +6795,7 @@
                 <w:sz w:val="16"/>
                 <w:szCs w:val="16"/>
               </w:rPr>
-              <w:t>genehmigt am</w:t>
+              <w:t xml:space="preserve">Genehmigt am ${genehmigt}</w:t>
             </w:r>
           </w:p>
         </w:tc>

</xml_diff>

<commit_message>
Aendere Dienstplan-Fuss: Namen aus Einstellungen, Unterschrift nach Geschlecht
Template diensteinsatzplan_template.docx: "durch stellvtr. Schulleitung"
wird zu "durch ${ersteller}", "durch Schulleitung" zu "durch ${genehmiger}".
Die Zeile "durch Tagesstaettenleitung" bleibt, weil die Tagesstaette nicht
im Burgermenue hinterlegt ist. In der Fusszeile (word/footer2.xml) steht
statt "Unterschrift Mitarbeiter/in" jetzt ${unterschrift}.

Ersteller ist "Nachname, Titel" des Schuljahres mit dem globalen
Anzeigenamen als Rueckfall, Genehmiger kommt aus dem gleichnamigen Feld;
beide werden von mehrfachen Leerzeichen befreit. Die Unterschriftszeile
ist weiblich als Standard und laesst das "in" nur bei einer als
maennlich gefuehrten Zweitkraft weg.

Co-Authored-By: Claude Opus 5 <noreply@anthropic.com>
</commit_message>
<xml_diff>
--- a/src/assets/diensteinsatzplan_template.docx
+++ b/src/assets/diensteinsatzplan_template.docx
@@ -6111,7 +6111,7 @@
                 <w:sz w:val="16"/>
                 <w:szCs w:val="16"/>
               </w:rPr>
-              <w:t xml:space="preserve">durch stellvtr. Schulleitung</w:t>
+              <w:t xml:space="preserve">durch ${ersteller}</w:t>
             </w:r>
           </w:p>
         </w:tc>
@@ -6478,7 +6478,7 @@
                 <w:sz w:val="16"/>
                 <w:szCs w:val="16"/>
               </w:rPr>
-              <w:t xml:space="preserve">durch Schulleitung</w:t>
+              <w:t xml:space="preserve">durch ${genehmiger}</w:t>
             </w:r>
           </w:p>
         </w:tc>
@@ -7135,7 +7135,7 @@
         <w:sz w:val="12"/>
         <w:szCs w:val="12"/>
       </w:rPr>
-      <w:t xml:space="preserve">                                                                  Unterschrift Mitarbeiter/in                                                                                                                                                                                                                            Regierung von NDB</w:t>
+      <w:t xml:space="preserve">                                                                  ${unterschrift}                                                                                                                                                                                                                            Regierung von NDB</w:t>
     </w:r>
   </w:p>
 </w:ftr>

</xml_diff>

<commit_message>
Fix: Genehmigt-Datum im Diensteinsatzplan war abgeschnitten
Das Feld sah leer aus, war es aber nicht: der Export setzt seit jeher
date('d.m.y', strtotime('+1 day')), und im Dokument stand auch
"Genehmigt am 07.09.26". Sichtbar war es trotzdem nicht.

Bei "Erstellt am" liegen Text und Datum in zwei Zellen (1968 + 1134
Twips). In den beiden Genehmigt-Zeilen steckte dagegen alles in einer
Zelle - "Genehmigt am ${genehmigt}" in der schmaleren Textspalte, die
Datumsspalte daneben leer. Weil die Zeile eine feste Hoehe hat, konnte
der Text nicht umbrechen und das Datum wurde abgeschnitten.

${genehmigt} steht jetzt in beiden Zeilen in der Datumsspalte, wie bei
"Erstellt am". Die Datumslogik ist unveraendert - sie war richtig.

Beide Genehmigt-Zeilen teilen sich weiterhin denselben Platzhalter.
Braeuchten Schulleitung und Tagesstaettenleitung verschiedene Daten,
waere ein zweiter noetig.

Co-Authored-By: Claude Opus 5 <noreply@anthropic.com>
</commit_message>
<xml_diff>
--- a/src/assets/diensteinsatzplan_template.docx
+++ b/src/assets/diensteinsatzplan_template.docx
@@ -6456,7 +6456,7 @@
                 <w:sz w:val="16"/>
                 <w:szCs w:val="16"/>
               </w:rPr>
-              <w:t xml:space="preserve">Genehmigt am ${genehmigt}</w:t>
+              <w:t xml:space="preserve">Genehmigt am</w:t>
             </w:r>
           </w:p>
         </w:tc>
@@ -6479,6 +6479,14 @@
                 <w:szCs w:val="16"/>
               </w:rPr>
             </w:pPr>
+            <w:r>
+              <w:rPr>
+                <w:rFonts w:ascii="Comic Sans MS" w:hAnsi="Comic Sans MS"/>
+                <w:sz w:val="16"/>
+                <w:szCs w:val="16"/>
+              </w:rPr>
+              <w:t xml:space="preserve">${genehmigt}</w:t>
+            </w:r>
           </w:p>
         </w:tc>
         <w:tc>
@@ -6823,7 +6831,7 @@
                 <w:sz w:val="16"/>
                 <w:szCs w:val="16"/>
               </w:rPr>
-              <w:t xml:space="preserve">Genehmigt am ${genehmigt}</w:t>
+              <w:t xml:space="preserve">Genehmigt am</w:t>
             </w:r>
           </w:p>
         </w:tc>
@@ -6846,6 +6854,14 @@
                 <w:szCs w:val="16"/>
               </w:rPr>
             </w:pPr>
+            <w:r>
+              <w:rPr>
+                <w:rFonts w:ascii="Comic Sans MS" w:hAnsi="Comic Sans MS"/>
+                <w:sz w:val="16"/>
+                <w:szCs w:val="16"/>
+              </w:rPr>
+              <w:t xml:space="preserve">${genehmigt}</w:t>
+            </w:r>
           </w:p>
         </w:tc>
         <w:tc>

</xml_diff>